<commit_message>
update the pdf file2
</commit_message>
<xml_diff>
--- a/public/portfolio/Collision_Fatality_Prediction_Report.docx
+++ b/public/portfolio/Collision_Fatality_Prediction_Report.docx
@@ -5,6 +5,7 @@
     <w:sdt>
       <w:sdtPr>
         <w:rPr>
+          <w:rFonts w:eastAsiaTheme="minorHAnsi"/>
           <w:color w:val="156082" w:themeColor="accent1"/>
           <w:kern w:val="2"/>
           <w:lang w:val="en-CA"/>
@@ -119,7 +120,18 @@
               <w:szCs w:val="72"/>
               <w:lang w:val="en-CA"/>
             </w:rPr>
-            <w:t>Traffic Accident Analysis Report</w:t>
+            <w:t>COLLISION FATALITY PREDICTION</w:t>
+          </w:r>
+          <w:r>
+            <w:rPr>
+              <w:rFonts w:asciiTheme="majorHAnsi" w:eastAsiaTheme="majorEastAsia" w:hAnsiTheme="majorHAnsi" w:cstheme="majorBidi"/>
+              <w:caps/>
+              <w:color w:val="156082" w:themeColor="accent1"/>
+              <w:sz w:val="72"/>
+              <w:szCs w:val="72"/>
+              <w:lang w:val="en-CA"/>
+            </w:rPr>
+            <w:t xml:space="preserve"> Report</w:t>
           </w:r>
         </w:p>
         <w:p>
@@ -213,288 +225,16 @@
             <mc:AlternateContent>
               <mc:Choice Requires="wps">
                 <w:drawing>
-                  <wp:anchor distT="0" distB="0" distL="114300" distR="114300" simplePos="0" relativeHeight="251658241" behindDoc="0" locked="0" layoutInCell="1" allowOverlap="1" wp14:anchorId="37321571" wp14:editId="16D9E404">
+                  <wp:anchor distT="0" distB="0" distL="114300" distR="114300" simplePos="0" relativeHeight="251658240" behindDoc="0" locked="0" layoutInCell="1" allowOverlap="1" wp14:anchorId="732CD79D" wp14:editId="1994D3C6">
                     <wp:simplePos x="0" y="0"/>
                     <wp:positionH relativeFrom="margin">
-                      <wp:posOffset>0</wp:posOffset>
+                      <wp:align>right</wp:align>
                     </wp:positionH>
                     <wp:positionV relativeFrom="page">
-                      <wp:posOffset>6647180</wp:posOffset>
-                    </wp:positionV>
-                    <wp:extent cx="6553200" cy="1153258"/>
-                    <wp:effectExtent l="0" t="0" r="0" b="8890"/>
-                    <wp:wrapNone/>
-                    <wp:docPr id="962910371" name="Text Box 146"/>
-                    <wp:cNvGraphicFramePr/>
-                    <a:graphic xmlns:a="http://schemas.openxmlformats.org/drawingml/2006/main">
-                      <a:graphicData uri="http://schemas.microsoft.com/office/word/2010/wordprocessingShape">
-                        <wps:wsp>
-                          <wps:cNvSpPr txBox="1"/>
-                          <wps:spPr>
-                            <a:xfrm>
-                              <a:off x="0" y="0"/>
-                              <a:ext cx="6553200" cy="1153258"/>
-                            </a:xfrm>
-                            <a:prstGeom prst="rect">
-                              <a:avLst/>
-                            </a:prstGeom>
-                            <a:noFill/>
-                            <a:ln w="6350">
-                              <a:noFill/>
-                            </a:ln>
-                            <a:effectLst/>
-                          </wps:spPr>
-                          <wps:style>
-                            <a:lnRef idx="0">
-                              <a:schemeClr val="accent1"/>
-                            </a:lnRef>
-                            <a:fillRef idx="0">
-                              <a:schemeClr val="accent1"/>
-                            </a:fillRef>
-                            <a:effectRef idx="0">
-                              <a:schemeClr val="accent1"/>
-                            </a:effectRef>
-                            <a:fontRef idx="minor">
-                              <a:schemeClr val="dk1"/>
-                            </a:fontRef>
-                          </wps:style>
-                          <wps:txbx>
-                            <w:txbxContent>
-                              <w:p>
-                                <w:pPr>
-                                  <w:pStyle w:val="NoSpacing"/>
-                                  <w:jc w:val="center"/>
-                                  <w:rPr>
-                                    <w:color w:val="156082" w:themeColor="accent1"/>
-                                  </w:rPr>
-                                </w:pPr>
-                                <w:r>
-                                  <w:rPr>
-                                    <w:color w:val="156082" w:themeColor="accent1"/>
-                                  </w:rPr>
-                                  <w:t>Group Members</w:t>
-                                </w:r>
-                              </w:p>
-                              <w:p>
-                                <w:pPr>
-                                  <w:pStyle w:val="NoSpacing"/>
-                                  <w:jc w:val="center"/>
-                                  <w:rPr>
-                                    <w:color w:val="156082" w:themeColor="accent1"/>
-                                  </w:rPr>
-                                </w:pPr>
-                                <w:r>
-                                  <w:rPr>
-                                    <w:color w:val="156082" w:themeColor="accent1"/>
-                                  </w:rPr>
-                                  <w:t>Jaturaput Jongsubcharoen</w:t>
-                                </w:r>
-                              </w:p>
-                              <w:p>
-                                <w:pPr>
-                                  <w:pStyle w:val="NoSpacing"/>
-                                  <w:jc w:val="center"/>
-                                  <w:rPr>
-                                    <w:color w:val="156082" w:themeColor="accent1"/>
-                                  </w:rPr>
-                                </w:pPr>
-                                <w:r>
-                                  <w:rPr>
-                                    <w:color w:val="156082" w:themeColor="accent1"/>
-                                  </w:rPr>
-                                  <w:t>Juan David Barrero Guerrero</w:t>
-                                </w:r>
-                              </w:p>
-                              <w:p>
-                                <w:pPr>
-                                  <w:pStyle w:val="NoSpacing"/>
-                                  <w:jc w:val="center"/>
-                                  <w:rPr>
-                                    <w:color w:val="156082" w:themeColor="accent1"/>
-                                  </w:rPr>
-                                </w:pPr>
-                                <w:r>
-                                  <w:rPr>
-                                    <w:color w:val="156082" w:themeColor="accent1"/>
-                                  </w:rPr>
-                                  <w:t>Adorn Shaju</w:t>
-                                </w:r>
-                              </w:p>
-                              <w:p>
-                                <w:pPr>
-                                  <w:pStyle w:val="NoSpacing"/>
-                                  <w:jc w:val="center"/>
-                                  <w:rPr>
-                                    <w:color w:val="156082" w:themeColor="accent1"/>
-                                  </w:rPr>
-                                </w:pPr>
-                                <w:r>
-                                  <w:rPr>
-                                    <w:color w:val="156082" w:themeColor="accent1"/>
-                                  </w:rPr>
-                                  <w:t>Anand Sharma</w:t>
-                                </w:r>
-                              </w:p>
-                              <w:p>
-                                <w:pPr>
-                                  <w:pStyle w:val="NoSpacing"/>
-                                  <w:jc w:val="center"/>
-                                  <w:rPr>
-                                    <w:color w:val="156082" w:themeColor="accent1"/>
-                                  </w:rPr>
-                                </w:pPr>
-                                <w:r>
-                                  <w:rPr>
-                                    <w:color w:val="156082" w:themeColor="accent1"/>
-                                  </w:rPr>
-                                  <w:t>Akash Sukumaran</w:t>
-                                </w:r>
-                              </w:p>
-                            </w:txbxContent>
-                          </wps:txbx>
-                          <wps:bodyPr rot="0" spcFirstLastPara="0" vertOverflow="overflow" horzOverflow="overflow" vert="horz" wrap="square" lIns="0" tIns="0" rIns="0" bIns="0" numCol="1" spcCol="0" rtlCol="0" fromWordArt="0" anchor="b" anchorCtr="0" forceAA="0" compatLnSpc="1">
-                            <a:prstTxWarp prst="textNoShape">
-                              <a:avLst/>
-                            </a:prstTxWarp>
-                            <a:noAutofit/>
-                          </wps:bodyPr>
-                        </wps:wsp>
-                      </a:graphicData>
-                    </a:graphic>
-                    <wp14:sizeRelH relativeFrom="margin">
-                      <wp14:pctWidth>100000</wp14:pctWidth>
-                    </wp14:sizeRelH>
-                    <wp14:sizeRelV relativeFrom="margin">
-                      <wp14:pctHeight>0</wp14:pctHeight>
-                    </wp14:sizeRelV>
-                  </wp:anchor>
-                </w:drawing>
-              </mc:Choice>
-              <mc:Fallback>
-                <w:pict>
-                  <v:shapetype w14:anchorId="37321571" id="_x0000_t202" coordsize="21600,21600" o:spt="202" path="m,l,21600r21600,l21600,xe">
-                    <v:stroke joinstyle="miter"/>
-                    <v:path gradientshapeok="t" o:connecttype="rect"/>
-                  </v:shapetype>
-                  <v:shape id="Text Box 146" o:spid="_x0000_s1026" type="#_x0000_t202" style="position:absolute;margin-left:0;margin-top:523.4pt;width:516pt;height:90.8pt;z-index:251658241;visibility:visible;mso-wrap-style:square;mso-width-percent:1000;mso-height-percent:0;mso-wrap-distance-left:9pt;mso-wrap-distance-top:0;mso-wrap-distance-right:9pt;mso-wrap-distance-bottom:0;mso-position-horizontal:absolute;mso-position-horizontal-relative:margin;mso-position-vertical:absolute;mso-position-vertical-relative:page;mso-width-percent:1000;mso-height-percent:0;mso-width-relative:margin;mso-height-relative:margin;v-text-anchor:bottom" o:gfxdata="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" filled="f" stroked="f" strokeweight=".5pt">
-                    <v:textbox inset="0,0,0,0">
-                      <w:txbxContent>
-                        <w:p>
-                          <w:pPr>
-                            <w:pStyle w:val="NoSpacing"/>
-                            <w:jc w:val="center"/>
-                            <w:rPr>
-                              <w:color w:val="156082" w:themeColor="accent1"/>
-                            </w:rPr>
-                          </w:pPr>
-                          <w:r>
-                            <w:rPr>
-                              <w:color w:val="156082" w:themeColor="accent1"/>
-                            </w:rPr>
-                            <w:t>Group Members</w:t>
-                          </w:r>
-                        </w:p>
-                        <w:p>
-                          <w:pPr>
-                            <w:pStyle w:val="NoSpacing"/>
-                            <w:jc w:val="center"/>
-                            <w:rPr>
-                              <w:color w:val="156082" w:themeColor="accent1"/>
-                            </w:rPr>
-                          </w:pPr>
-                          <w:r>
-                            <w:rPr>
-                              <w:color w:val="156082" w:themeColor="accent1"/>
-                            </w:rPr>
-                            <w:t>Jaturaput Jongsubcharoen</w:t>
-                          </w:r>
-                        </w:p>
-                        <w:p>
-                          <w:pPr>
-                            <w:pStyle w:val="NoSpacing"/>
-                            <w:jc w:val="center"/>
-                            <w:rPr>
-                              <w:color w:val="156082" w:themeColor="accent1"/>
-                            </w:rPr>
-                          </w:pPr>
-                          <w:r>
-                            <w:rPr>
-                              <w:color w:val="156082" w:themeColor="accent1"/>
-                            </w:rPr>
-                            <w:t>Juan David Barrero Guerrero</w:t>
-                          </w:r>
-                        </w:p>
-                        <w:p>
-                          <w:pPr>
-                            <w:pStyle w:val="NoSpacing"/>
-                            <w:jc w:val="center"/>
-                            <w:rPr>
-                              <w:color w:val="156082" w:themeColor="accent1"/>
-                            </w:rPr>
-                          </w:pPr>
-                          <w:r>
-                            <w:rPr>
-                              <w:color w:val="156082" w:themeColor="accent1"/>
-                            </w:rPr>
-                            <w:t>Adorn Shaju</w:t>
-                          </w:r>
-                        </w:p>
-                        <w:p>
-                          <w:pPr>
-                            <w:pStyle w:val="NoSpacing"/>
-                            <w:jc w:val="center"/>
-                            <w:rPr>
-                              <w:color w:val="156082" w:themeColor="accent1"/>
-                            </w:rPr>
-                          </w:pPr>
-                          <w:r>
-                            <w:rPr>
-                              <w:color w:val="156082" w:themeColor="accent1"/>
-                            </w:rPr>
-                            <w:t>Anand Sharma</w:t>
-                          </w:r>
-                        </w:p>
-                        <w:p>
-                          <w:pPr>
-                            <w:pStyle w:val="NoSpacing"/>
-                            <w:jc w:val="center"/>
-                            <w:rPr>
-                              <w:color w:val="156082" w:themeColor="accent1"/>
-                            </w:rPr>
-                          </w:pPr>
-                          <w:r>
-                            <w:rPr>
-                              <w:color w:val="156082" w:themeColor="accent1"/>
-                            </w:rPr>
-                            <w:t>Akash Sukumaran</w:t>
-                          </w:r>
-                        </w:p>
-                      </w:txbxContent>
-                    </v:textbox>
-                    <w10:wrap anchorx="margin" anchory="page"/>
-                  </v:shape>
-                </w:pict>
-              </mc:Fallback>
-            </mc:AlternateContent>
-          </w:r>
-          <w:r>
-            <w:rPr>
-              <w:noProof/>
-              <w:color w:val="156082" w:themeColor="accent1"/>
-            </w:rPr>
-            <mc:AlternateContent>
-              <mc:Choice Requires="wps">
-                <w:drawing>
-                  <wp:anchor distT="0" distB="0" distL="114300" distR="114300" simplePos="0" relativeHeight="251658240" behindDoc="0" locked="0" layoutInCell="1" allowOverlap="1" wp14:anchorId="732CD79D" wp14:editId="42E2CDE9">
-                    <wp:simplePos x="0" y="0"/>
-                    <wp:positionH relativeFrom="margin">
-                      <wp:posOffset>0</wp:posOffset>
-                    </wp:positionH>
-                    <wp:positionV relativeFrom="page">
-                      <wp:posOffset>5340350</wp:posOffset>
+                      <wp:posOffset>6008566</wp:posOffset>
                     </wp:positionV>
                     <wp:extent cx="6553200" cy="557530"/>
-                    <wp:effectExtent l="0" t="0" r="0" b="635"/>
+                    <wp:effectExtent l="0" t="0" r="0" b="0"/>
                     <wp:wrapNone/>
                     <wp:docPr id="142" name="Text Box 146"/>
                     <wp:cNvGraphicFramePr/>
@@ -579,62 +319,10 @@
                               <w:p>
                                 <w:pPr>
                                   <w:pStyle w:val="NoSpacing"/>
-                                  <w:jc w:val="center"/>
                                   <w:rPr>
                                     <w:color w:val="156082" w:themeColor="accent1"/>
                                   </w:rPr>
                                 </w:pPr>
-                                <w:sdt>
-                                  <w:sdtPr>
-                                    <w:rPr>
-                                      <w:caps/>
-                                      <w:color w:val="156082" w:themeColor="accent1"/>
-                                    </w:rPr>
-                                    <w:alias w:val="Company"/>
-                                    <w:tag w:val=""/>
-                                    <w:id w:val="1390145197"/>
-                                    <w:dataBinding w:prefixMappings="xmlns:ns0='http://schemas.openxmlformats.org/officeDocument/2006/extended-properties' " w:xpath="/ns0:Properties[1]/ns0:Company[1]" w:storeItemID="{6668398D-A668-4E3E-A5EB-62B293D839F1}"/>
-                                    <w:text/>
-                                  </w:sdtPr>
-                                  <w:sdtContent>
-                                    <w:r>
-                                      <w:rPr>
-                                        <w:caps/>
-                                        <w:color w:val="156082" w:themeColor="accent1"/>
-                                      </w:rPr>
-                                      <w:t>GROUP 5</w:t>
-                                    </w:r>
-                                  </w:sdtContent>
-                                </w:sdt>
-                              </w:p>
-                              <w:p>
-                                <w:pPr>
-                                  <w:pStyle w:val="NoSpacing"/>
-                                  <w:jc w:val="center"/>
-                                  <w:rPr>
-                                    <w:color w:val="156082" w:themeColor="accent1"/>
-                                  </w:rPr>
-                                </w:pPr>
-                                <w:sdt>
-                                  <w:sdtPr>
-                                    <w:rPr>
-                                      <w:color w:val="156082" w:themeColor="accent1"/>
-                                    </w:rPr>
-                                    <w:alias w:val="Address"/>
-                                    <w:tag w:val=""/>
-                                    <w:id w:val="-726379553"/>
-                                    <w:dataBinding w:prefixMappings="xmlns:ns0='http://schemas.microsoft.com/office/2006/coverPageProps' " w:xpath="/ns0:CoverPageProperties[1]/ns0:CompanyAddress[1]" w:storeItemID="{55AF091B-3C7A-41E3-B477-F2FDAA23CFDA}"/>
-                                    <w:text/>
-                                  </w:sdtPr>
-                                  <w:sdtContent>
-                                    <w:r>
-                                      <w:rPr>
-                                        <w:color w:val="156082" w:themeColor="accent1"/>
-                                      </w:rPr>
-                                      <w:t>COMP 247</w:t>
-                                    </w:r>
-                                  </w:sdtContent>
-                                </w:sdt>
                               </w:p>
                             </w:txbxContent>
                           </wps:txbx>
@@ -658,7 +346,11 @@
               </mc:Choice>
               <mc:Fallback>
                 <w:pict>
-                  <v:shape w14:anchorId="732CD79D" id="_x0000_s1027" type="#_x0000_t202" style="position:absolute;margin-left:0;margin-top:420.5pt;width:516pt;height:43.9pt;z-index:251658240;visibility:visible;mso-wrap-style:square;mso-width-percent:1000;mso-height-percent:0;mso-wrap-distance-left:9pt;mso-wrap-distance-top:0;mso-wrap-distance-right:9pt;mso-wrap-distance-bottom:0;mso-position-horizontal:absolute;mso-position-horizontal-relative:margin;mso-position-vertical:absolute;mso-position-vertical-relative:page;mso-width-percent:1000;mso-height-percent:0;mso-width-relative:margin;mso-height-relative:margin;v-text-anchor:bottom" o:gfxdata="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" filled="f" stroked="f" strokeweight=".5pt">
+                  <v:shapetype w14:anchorId="732CD79D" id="_x0000_t202" coordsize="21600,21600" o:spt="202" path="m,l,21600r21600,l21600,xe">
+                    <v:stroke joinstyle="miter"/>
+                    <v:path gradientshapeok="t" o:connecttype="rect"/>
+                  </v:shapetype>
+                  <v:shape id="Text Box 146" o:spid="_x0000_s1026" type="#_x0000_t202" style="position:absolute;margin-left:464.8pt;margin-top:473.1pt;width:516pt;height:43.9pt;z-index:251658240;visibility:visible;mso-wrap-style:square;mso-width-percent:1000;mso-height-percent:0;mso-wrap-distance-left:9pt;mso-wrap-distance-top:0;mso-wrap-distance-right:9pt;mso-wrap-distance-bottom:0;mso-position-horizontal:right;mso-position-horizontal-relative:margin;mso-position-vertical:absolute;mso-position-vertical-relative:page;mso-width-percent:1000;mso-height-percent:0;mso-width-relative:margin;mso-height-relative:margin;v-text-anchor:bottom" o:gfxdata="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" filled="f" stroked="f" strokeweight=".5pt">
                     <v:textbox style="mso-fit-shape-to-text:t" inset="0,0,0,0">
                       <w:txbxContent>
                         <w:sdt>
@@ -708,33 +400,165 @@
                         <w:p>
                           <w:pPr>
                             <w:pStyle w:val="NoSpacing"/>
+                            <w:rPr>
+                              <w:color w:val="156082" w:themeColor="accent1"/>
+                            </w:rPr>
+                          </w:pPr>
+                        </w:p>
+                      </w:txbxContent>
+                    </v:textbox>
+                    <w10:wrap anchorx="margin" anchory="page"/>
+                  </v:shape>
+                </w:pict>
+              </mc:Fallback>
+            </mc:AlternateContent>
+          </w:r>
+          <w:r>
+            <w:rPr>
+              <w:noProof/>
+              <w:color w:val="156082" w:themeColor="accent1"/>
+            </w:rPr>
+            <mc:AlternateContent>
+              <mc:Choice Requires="wps">
+                <w:drawing>
+                  <wp:anchor distT="0" distB="0" distL="114300" distR="114300" simplePos="0" relativeHeight="251658241" behindDoc="0" locked="0" layoutInCell="1" allowOverlap="1" wp14:anchorId="37321571" wp14:editId="418B4368">
+                    <wp:simplePos x="0" y="0"/>
+                    <wp:positionH relativeFrom="margin">
+                      <wp:align>right</wp:align>
+                    </wp:positionH>
+                    <wp:positionV relativeFrom="page">
+                      <wp:posOffset>6945776</wp:posOffset>
+                    </wp:positionV>
+                    <wp:extent cx="6553200" cy="883285"/>
+                    <wp:effectExtent l="0" t="0" r="0" b="12065"/>
+                    <wp:wrapNone/>
+                    <wp:docPr id="962910371" name="Text Box 146"/>
+                    <wp:cNvGraphicFramePr/>
+                    <a:graphic xmlns:a="http://schemas.openxmlformats.org/drawingml/2006/main">
+                      <a:graphicData uri="http://schemas.microsoft.com/office/word/2010/wordprocessingShape">
+                        <wps:wsp>
+                          <wps:cNvSpPr txBox="1"/>
+                          <wps:spPr>
+                            <a:xfrm>
+                              <a:off x="0" y="0"/>
+                              <a:ext cx="6553200" cy="883285"/>
+                            </a:xfrm>
+                            <a:prstGeom prst="rect">
+                              <a:avLst/>
+                            </a:prstGeom>
+                            <a:noFill/>
+                            <a:ln w="6350">
+                              <a:noFill/>
+                            </a:ln>
+                            <a:effectLst/>
+                          </wps:spPr>
+                          <wps:style>
+                            <a:lnRef idx="0">
+                              <a:schemeClr val="accent1"/>
+                            </a:lnRef>
+                            <a:fillRef idx="0">
+                              <a:schemeClr val="accent1"/>
+                            </a:fillRef>
+                            <a:effectRef idx="0">
+                              <a:schemeClr val="accent1"/>
+                            </a:effectRef>
+                            <a:fontRef idx="minor">
+                              <a:schemeClr val="dk1"/>
+                            </a:fontRef>
+                          </wps:style>
+                          <wps:txbx>
+                            <w:txbxContent>
+                              <w:p>
+                                <w:pPr>
+                                  <w:pStyle w:val="NoSpacing"/>
+                                  <w:jc w:val="center"/>
+                                  <w:rPr>
+                                    <w:color w:val="156082" w:themeColor="accent1"/>
+                                  </w:rPr>
+                                </w:pPr>
+                                <w:proofErr w:type="gramStart"/>
+                                <w:r>
+                                  <w:rPr>
+                                    <w:color w:val="156082" w:themeColor="accent1"/>
+                                  </w:rPr>
+                                  <w:t>By</w:t>
+                                </w:r>
+                                <w:proofErr w:type="gramEnd"/>
+                              </w:p>
+                              <w:p>
+                                <w:pPr>
+                                  <w:pStyle w:val="NoSpacing"/>
+                                  <w:jc w:val="center"/>
+                                  <w:rPr>
+                                    <w:color w:val="156082" w:themeColor="accent1"/>
+                                  </w:rPr>
+                                </w:pPr>
+                              </w:p>
+                              <w:p>
+                                <w:pPr>
+                                  <w:pStyle w:val="NoSpacing"/>
+                                  <w:jc w:val="center"/>
+                                  <w:rPr>
+                                    <w:color w:val="156082" w:themeColor="accent1"/>
+                                  </w:rPr>
+                                </w:pPr>
+                                <w:r>
+                                  <w:rPr>
+                                    <w:color w:val="156082" w:themeColor="accent1"/>
+                                  </w:rPr>
+                                  <w:t>Jaturaput Jongsubcharoen</w:t>
+                                </w:r>
+                              </w:p>
+                              <w:p>
+                                <w:pPr>
+                                  <w:pStyle w:val="NoSpacing"/>
+                                  <w:jc w:val="center"/>
+                                  <w:rPr>
+                                    <w:color w:val="156082" w:themeColor="accent1"/>
+                                  </w:rPr>
+                                </w:pPr>
+                              </w:p>
+                            </w:txbxContent>
+                          </wps:txbx>
+                          <wps:bodyPr rot="0" spcFirstLastPara="0" vertOverflow="overflow" horzOverflow="overflow" vert="horz" wrap="square" lIns="0" tIns="0" rIns="0" bIns="0" numCol="1" spcCol="0" rtlCol="0" fromWordArt="0" anchor="b" anchorCtr="0" forceAA="0" compatLnSpc="1">
+                            <a:prstTxWarp prst="textNoShape">
+                              <a:avLst/>
+                            </a:prstTxWarp>
+                            <a:noAutofit/>
+                          </wps:bodyPr>
+                        </wps:wsp>
+                      </a:graphicData>
+                    </a:graphic>
+                    <wp14:sizeRelH relativeFrom="margin">
+                      <wp14:pctWidth>100000</wp14:pctWidth>
+                    </wp14:sizeRelH>
+                    <wp14:sizeRelV relativeFrom="margin">
+                      <wp14:pctHeight>0</wp14:pctHeight>
+                    </wp14:sizeRelV>
+                  </wp:anchor>
+                </w:drawing>
+              </mc:Choice>
+              <mc:Fallback>
+                <w:pict>
+                  <v:shape w14:anchorId="37321571" id="_x0000_s1027" type="#_x0000_t202" style="position:absolute;margin-left:464.8pt;margin-top:546.9pt;width:516pt;height:69.55pt;z-index:251658241;visibility:visible;mso-wrap-style:square;mso-width-percent:1000;mso-height-percent:0;mso-wrap-distance-left:9pt;mso-wrap-distance-top:0;mso-wrap-distance-right:9pt;mso-wrap-distance-bottom:0;mso-position-horizontal:right;mso-position-horizontal-relative:margin;mso-position-vertical:absolute;mso-position-vertical-relative:page;mso-width-percent:1000;mso-height-percent:0;mso-width-relative:margin;mso-height-relative:margin;v-text-anchor:bottom" o:gfxdata="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" filled="f" stroked="f" strokeweight=".5pt">
+                    <v:textbox inset="0,0,0,0">
+                      <w:txbxContent>
+                        <w:p>
+                          <w:pPr>
+                            <w:pStyle w:val="NoSpacing"/>
                             <w:jc w:val="center"/>
                             <w:rPr>
                               <w:color w:val="156082" w:themeColor="accent1"/>
                             </w:rPr>
                           </w:pPr>
-                          <w:sdt>
-                            <w:sdtPr>
-                              <w:rPr>
-                                <w:caps/>
-                                <w:color w:val="156082" w:themeColor="accent1"/>
-                              </w:rPr>
-                              <w:alias w:val="Company"/>
-                              <w:tag w:val=""/>
-                              <w:id w:val="1390145197"/>
-                              <w:dataBinding w:prefixMappings="xmlns:ns0='http://schemas.openxmlformats.org/officeDocument/2006/extended-properties' " w:xpath="/ns0:Properties[1]/ns0:Company[1]" w:storeItemID="{6668398D-A668-4E3E-A5EB-62B293D839F1}"/>
-                              <w:text/>
-                            </w:sdtPr>
-                            <w:sdtContent>
-                              <w:r>
-                                <w:rPr>
-                                  <w:caps/>
-                                  <w:color w:val="156082" w:themeColor="accent1"/>
-                                </w:rPr>
-                                <w:t>GROUP 5</w:t>
-                              </w:r>
-                            </w:sdtContent>
-                          </w:sdt>
+                          <w:proofErr w:type="gramStart"/>
+                          <w:r>
+                            <w:rPr>
+                              <w:color w:val="156082" w:themeColor="accent1"/>
+                            </w:rPr>
+                            <w:t>By</w:t>
+                          </w:r>
+                          <w:proofErr w:type="gramEnd"/>
                         </w:p>
                         <w:p>
                           <w:pPr>
@@ -744,26 +568,30 @@
                               <w:color w:val="156082" w:themeColor="accent1"/>
                             </w:rPr>
                           </w:pPr>
-                          <w:sdt>
-                            <w:sdtPr>
-                              <w:rPr>
-                                <w:color w:val="156082" w:themeColor="accent1"/>
-                              </w:rPr>
-                              <w:alias w:val="Address"/>
-                              <w:tag w:val=""/>
-                              <w:id w:val="-726379553"/>
-                              <w:dataBinding w:prefixMappings="xmlns:ns0='http://schemas.microsoft.com/office/2006/coverPageProps' " w:xpath="/ns0:CoverPageProperties[1]/ns0:CompanyAddress[1]" w:storeItemID="{55AF091B-3C7A-41E3-B477-F2FDAA23CFDA}"/>
-                              <w:text/>
-                            </w:sdtPr>
-                            <w:sdtContent>
-                              <w:r>
-                                <w:rPr>
-                                  <w:color w:val="156082" w:themeColor="accent1"/>
-                                </w:rPr>
-                                <w:t>COMP 247</w:t>
-                              </w:r>
-                            </w:sdtContent>
-                          </w:sdt>
+                        </w:p>
+                        <w:p>
+                          <w:pPr>
+                            <w:pStyle w:val="NoSpacing"/>
+                            <w:jc w:val="center"/>
+                            <w:rPr>
+                              <w:color w:val="156082" w:themeColor="accent1"/>
+                            </w:rPr>
+                          </w:pPr>
+                          <w:r>
+                            <w:rPr>
+                              <w:color w:val="156082" w:themeColor="accent1"/>
+                            </w:rPr>
+                            <w:t>Jaturaput Jongsubcharoen</w:t>
+                          </w:r>
+                        </w:p>
+                        <w:p>
+                          <w:pPr>
+                            <w:pStyle w:val="NoSpacing"/>
+                            <w:jc w:val="center"/>
+                            <w:rPr>
+                              <w:color w:val="156082" w:themeColor="accent1"/>
+                            </w:rPr>
+                          </w:pPr>
                         </w:p>
                       </w:txbxContent>
                     </v:textbox>
@@ -5482,7 +5310,31 @@
           <w:szCs w:val="28"/>
         </w:rPr>
         <w:lastRenderedPageBreak/>
-        <w:t>4. Collision Type (Fatal vs Non-Fatal)</w:t>
+        <w:t xml:space="preserve">4. Collision Type (Fatal vs </w:t>
+      </w:r>
+      <w:proofErr w:type="gramStart"/>
+      <w:r>
+        <w:rPr>
+          <w:rFonts w:ascii="Times New Roman" w:eastAsia="Times New Roman" w:hAnsi="Times New Roman" w:cs="Times New Roman"/>
+          <w:b/>
+          <w:bCs/>
+          <w:color w:val="auto"/>
+          <w:sz w:val="28"/>
+          <w:szCs w:val="28"/>
+        </w:rPr>
+        <w:t>Non-Fatal</w:t>
+      </w:r>
+      <w:proofErr w:type="gramEnd"/>
+      <w:r>
+        <w:rPr>
+          <w:rFonts w:ascii="Times New Roman" w:eastAsia="Times New Roman" w:hAnsi="Times New Roman" w:cs="Times New Roman"/>
+          <w:b/>
+          <w:bCs/>
+          <w:color w:val="auto"/>
+          <w:sz w:val="28"/>
+          <w:szCs w:val="28"/>
+        </w:rPr>
+        <w:t>)</w:t>
       </w:r>
       <w:bookmarkEnd w:id="6"/>
     </w:p>
@@ -6020,7 +5872,25 @@
           <w:sz w:val="28"/>
           <w:szCs w:val="28"/>
         </w:rPr>
-        <w:t>Implication: Models may bias toward predicting the majority class (Non-Fatal).</w:t>
+        <w:t>Implication: Models may bias toward predicting the majority class (</w:t>
+      </w:r>
+      <w:proofErr w:type="gramStart"/>
+      <w:r>
+        <w:rPr>
+          <w:rFonts w:ascii="Times New Roman" w:eastAsia="Times New Roman" w:hAnsi="Times New Roman" w:cs="Times New Roman"/>
+          <w:sz w:val="28"/>
+          <w:szCs w:val="28"/>
+        </w:rPr>
+        <w:t>Non-Fatal</w:t>
+      </w:r>
+      <w:proofErr w:type="gramEnd"/>
+      <w:r>
+        <w:rPr>
+          <w:rFonts w:ascii="Times New Roman" w:eastAsia="Times New Roman" w:hAnsi="Times New Roman" w:cs="Times New Roman"/>
+          <w:sz w:val="28"/>
+          <w:szCs w:val="28"/>
+        </w:rPr>
+        <w:t>).</w:t>
       </w:r>
     </w:p>
     <w:p>
@@ -8816,7 +8686,7 @@
           <w:noProof/>
         </w:rPr>
         <w:drawing>
-          <wp:inline distT="0" distB="0" distL="0" distR="0" wp14:anchorId="03C6A0A5" wp14:editId="57F9EF15">
+          <wp:inline distT="0" distB="0" distL="0" distR="0" wp14:anchorId="03C6A0A5" wp14:editId="3F28A7BA">
             <wp:extent cx="5943600" cy="3343275"/>
             <wp:effectExtent l="0" t="0" r="0" b="0"/>
             <wp:docPr id="1388759151" name="Picture 1388759151"/>
@@ -8880,7 +8750,39 @@
           <w:rFonts w:ascii="Times New Roman" w:eastAsia="Times New Roman" w:hAnsi="Times New Roman" w:cs="Times New Roman"/>
           <w:color w:val="auto"/>
         </w:rPr>
-        <w:t xml:space="preserve">used GridSearch in order to Automatically test many combinations of hyperparameters. </w:t>
+        <w:t xml:space="preserve">used </w:t>
+      </w:r>
+      <w:proofErr w:type="spellStart"/>
+      <w:r>
+        <w:rPr>
+          <w:rFonts w:ascii="Times New Roman" w:eastAsia="Times New Roman" w:hAnsi="Times New Roman" w:cs="Times New Roman"/>
+          <w:color w:val="auto"/>
+        </w:rPr>
+        <w:t>GridSearch</w:t>
+      </w:r>
+      <w:proofErr w:type="spellEnd"/>
+      <w:r>
+        <w:rPr>
+          <w:rFonts w:ascii="Times New Roman" w:eastAsia="Times New Roman" w:hAnsi="Times New Roman" w:cs="Times New Roman"/>
+          <w:color w:val="auto"/>
+        </w:rPr>
+        <w:t xml:space="preserve"> </w:t>
+      </w:r>
+      <w:proofErr w:type="gramStart"/>
+      <w:r>
+        <w:rPr>
+          <w:rFonts w:ascii="Times New Roman" w:eastAsia="Times New Roman" w:hAnsi="Times New Roman" w:cs="Times New Roman"/>
+          <w:color w:val="auto"/>
+        </w:rPr>
+        <w:t>in order to</w:t>
+      </w:r>
+      <w:proofErr w:type="gramEnd"/>
+      <w:r>
+        <w:rPr>
+          <w:rFonts w:ascii="Times New Roman" w:eastAsia="Times New Roman" w:hAnsi="Times New Roman" w:cs="Times New Roman"/>
+          <w:color w:val="auto"/>
+        </w:rPr>
+        <w:t xml:space="preserve"> Automatically test many combinations of hyperparameters. </w:t>
       </w:r>
     </w:p>
     <w:p>
@@ -8911,7 +8813,23 @@
           <w:rFonts w:ascii="Times New Roman" w:eastAsia="Times New Roman" w:hAnsi="Times New Roman" w:cs="Times New Roman"/>
           <w:color w:val="auto"/>
         </w:rPr>
-        <w:t xml:space="preserve">set n_estimators </w:t>
+        <w:t xml:space="preserve">set </w:t>
+      </w:r>
+      <w:proofErr w:type="spellStart"/>
+      <w:r>
+        <w:rPr>
+          <w:rFonts w:ascii="Times New Roman" w:eastAsia="Times New Roman" w:hAnsi="Times New Roman" w:cs="Times New Roman"/>
+          <w:color w:val="auto"/>
+        </w:rPr>
+        <w:t>n_estimators</w:t>
+      </w:r>
+      <w:proofErr w:type="spellEnd"/>
+      <w:r>
+        <w:rPr>
+          <w:rFonts w:ascii="Times New Roman" w:eastAsia="Times New Roman" w:hAnsi="Times New Roman" w:cs="Times New Roman"/>
+          <w:color w:val="auto"/>
+        </w:rPr>
+        <w:t xml:space="preserve"> </w:t>
       </w:r>
       <w:r>
         <w:rPr>
@@ -8988,7 +8906,23 @@
           <w:rFonts w:ascii="Times New Roman" w:eastAsia="Times New Roman" w:hAnsi="Times New Roman" w:cs="Times New Roman"/>
           <w:color w:val="auto"/>
         </w:rPr>
-        <w:t xml:space="preserve"> this improves performance by increasing more tree, so the model will give better averaging and lower variance, but it costs more training time. By default, if n_estimators is not set, it will be set to 100. </w:t>
+        <w:t xml:space="preserve"> this improves performance by increasing more tree, so the model will give better averaging and lower variance, but it costs more training time. By default, if </w:t>
+      </w:r>
+      <w:proofErr w:type="spellStart"/>
+      <w:r>
+        <w:rPr>
+          <w:rFonts w:ascii="Times New Roman" w:eastAsia="Times New Roman" w:hAnsi="Times New Roman" w:cs="Times New Roman"/>
+          <w:color w:val="auto"/>
+        </w:rPr>
+        <w:t>n_estimators</w:t>
+      </w:r>
+      <w:proofErr w:type="spellEnd"/>
+      <w:r>
+        <w:rPr>
+          <w:rFonts w:ascii="Times New Roman" w:eastAsia="Times New Roman" w:hAnsi="Times New Roman" w:cs="Times New Roman"/>
+          <w:color w:val="auto"/>
+        </w:rPr>
+        <w:t xml:space="preserve"> is not set, it will be set to 100. </w:t>
       </w:r>
     </w:p>
     <w:p>
@@ -9005,7 +8939,23 @@
           <w:rFonts w:ascii="Times New Roman" w:eastAsia="Times New Roman" w:hAnsi="Times New Roman" w:cs="Times New Roman"/>
           <w:color w:val="auto"/>
         </w:rPr>
-        <w:t>Second, I set max_depth to 2</w:t>
+        <w:t xml:space="preserve">Second, I set </w:t>
+      </w:r>
+      <w:proofErr w:type="spellStart"/>
+      <w:r>
+        <w:rPr>
+          <w:rFonts w:ascii="Times New Roman" w:eastAsia="Times New Roman" w:hAnsi="Times New Roman" w:cs="Times New Roman"/>
+          <w:color w:val="auto"/>
+        </w:rPr>
+        <w:t>max_depth</w:t>
+      </w:r>
+      <w:proofErr w:type="spellEnd"/>
+      <w:r>
+        <w:rPr>
+          <w:rFonts w:ascii="Times New Roman" w:eastAsia="Times New Roman" w:hAnsi="Times New Roman" w:cs="Times New Roman"/>
+          <w:color w:val="auto"/>
+        </w:rPr>
+        <w:t xml:space="preserve"> to 2</w:t>
       </w:r>
       <w:r>
         <w:rPr>
@@ -9061,7 +9011,23 @@
           <w:rFonts w:ascii="Times New Roman" w:eastAsia="Times New Roman" w:hAnsi="Times New Roman" w:cs="Times New Roman"/>
           <w:color w:val="auto"/>
         </w:rPr>
-        <w:t xml:space="preserve"> this can help the model preventing overfitting, which it especially is used when the model must deal with imbalanced or noisy dataset. By default, if max_depth is not set, it will be set to “None”. </w:t>
+        <w:t xml:space="preserve"> this can help the model preventing overfitting, which it especially is used when the model must deal with imbalanced or noisy dataset. By default, if </w:t>
+      </w:r>
+      <w:proofErr w:type="spellStart"/>
+      <w:r>
+        <w:rPr>
+          <w:rFonts w:ascii="Times New Roman" w:eastAsia="Times New Roman" w:hAnsi="Times New Roman" w:cs="Times New Roman"/>
+          <w:color w:val="auto"/>
+        </w:rPr>
+        <w:t>max_depth</w:t>
+      </w:r>
+      <w:proofErr w:type="spellEnd"/>
+      <w:r>
+        <w:rPr>
+          <w:rFonts w:ascii="Times New Roman" w:eastAsia="Times New Roman" w:hAnsi="Times New Roman" w:cs="Times New Roman"/>
+          <w:color w:val="auto"/>
+        </w:rPr>
+        <w:t xml:space="preserve"> is not set, it will be set to “None”. </w:t>
       </w:r>
     </w:p>
     <w:p>
@@ -9079,7 +9045,23 @@
           <w:rFonts w:ascii="Times New Roman" w:eastAsia="Times New Roman" w:hAnsi="Times New Roman" w:cs="Times New Roman"/>
           <w:color w:val="auto"/>
         </w:rPr>
-        <w:t xml:space="preserve">Third, I set class_weight to “balance” </w:t>
+        <w:t xml:space="preserve">Third, I set </w:t>
+      </w:r>
+      <w:proofErr w:type="spellStart"/>
+      <w:r>
+        <w:rPr>
+          <w:rFonts w:ascii="Times New Roman" w:eastAsia="Times New Roman" w:hAnsi="Times New Roman" w:cs="Times New Roman"/>
+          <w:color w:val="auto"/>
+        </w:rPr>
+        <w:t>class_weight</w:t>
+      </w:r>
+      <w:proofErr w:type="spellEnd"/>
+      <w:r>
+        <w:rPr>
+          <w:rFonts w:ascii="Times New Roman" w:eastAsia="Times New Roman" w:hAnsi="Times New Roman" w:cs="Times New Roman"/>
+          <w:color w:val="auto"/>
+        </w:rPr>
+        <w:t xml:space="preserve"> to “balance” </w:t>
       </w:r>
       <w:r>
         <w:rPr>
@@ -9128,7 +9110,39 @@
           <w:rFonts w:ascii="Times New Roman" w:eastAsia="Times New Roman" w:hAnsi="Times New Roman" w:cs="Times New Roman"/>
           <w:color w:val="auto"/>
         </w:rPr>
-        <w:t xml:space="preserve"> this gives a best performance of balancing the dataset, for example when dealing with ACCLASS class, such as Fatal (1) or Non-Fatal (0). By default, if class_weight is not set, it will be set to “None”. </w:t>
+        <w:t xml:space="preserve"> this gives a best performance of balancing the dataset, for example when dealing with ACCLASS class, such as Fatal (1) or </w:t>
+      </w:r>
+      <w:proofErr w:type="gramStart"/>
+      <w:r>
+        <w:rPr>
+          <w:rFonts w:ascii="Times New Roman" w:eastAsia="Times New Roman" w:hAnsi="Times New Roman" w:cs="Times New Roman"/>
+          <w:color w:val="auto"/>
+        </w:rPr>
+        <w:t>Non-Fatal</w:t>
+      </w:r>
+      <w:proofErr w:type="gramEnd"/>
+      <w:r>
+        <w:rPr>
+          <w:rFonts w:ascii="Times New Roman" w:eastAsia="Times New Roman" w:hAnsi="Times New Roman" w:cs="Times New Roman"/>
+          <w:color w:val="auto"/>
+        </w:rPr>
+        <w:t xml:space="preserve"> (0). By default, if </w:t>
+      </w:r>
+      <w:proofErr w:type="spellStart"/>
+      <w:r>
+        <w:rPr>
+          <w:rFonts w:ascii="Times New Roman" w:eastAsia="Times New Roman" w:hAnsi="Times New Roman" w:cs="Times New Roman"/>
+          <w:color w:val="auto"/>
+        </w:rPr>
+        <w:t>class_weight</w:t>
+      </w:r>
+      <w:proofErr w:type="spellEnd"/>
+      <w:r>
+        <w:rPr>
+          <w:rFonts w:ascii="Times New Roman" w:eastAsia="Times New Roman" w:hAnsi="Times New Roman" w:cs="Times New Roman"/>
+          <w:color w:val="auto"/>
+        </w:rPr>
+        <w:t xml:space="preserve"> is not set, it will be set to “None”. </w:t>
       </w:r>
     </w:p>
     <w:p>
@@ -9145,7 +9159,55 @@
           <w:rFonts w:ascii="Times New Roman" w:eastAsia="Times New Roman" w:hAnsi="Times New Roman" w:cs="Times New Roman"/>
           <w:color w:val="auto"/>
         </w:rPr>
-        <w:t>Last, I set random_state to 25, which is my last student ID, and I use the same value in all models to control randomness and make the comparison fair. Infact, this ensures results across runs. By default, if random_state is not set, it will be set to “None”</w:t>
+        <w:t xml:space="preserve">Last, I set </w:t>
+      </w:r>
+      <w:proofErr w:type="spellStart"/>
+      <w:r>
+        <w:rPr>
+          <w:rFonts w:ascii="Times New Roman" w:eastAsia="Times New Roman" w:hAnsi="Times New Roman" w:cs="Times New Roman"/>
+          <w:color w:val="auto"/>
+        </w:rPr>
+        <w:t>random_state</w:t>
+      </w:r>
+      <w:proofErr w:type="spellEnd"/>
+      <w:r>
+        <w:rPr>
+          <w:rFonts w:ascii="Times New Roman" w:eastAsia="Times New Roman" w:hAnsi="Times New Roman" w:cs="Times New Roman"/>
+          <w:color w:val="auto"/>
+        </w:rPr>
+        <w:t xml:space="preserve"> to 25, which is my last student ID, and I use the same value in all models to control randomness and make the comparison fair. </w:t>
+      </w:r>
+      <w:proofErr w:type="spellStart"/>
+      <w:r>
+        <w:rPr>
+          <w:rFonts w:ascii="Times New Roman" w:eastAsia="Times New Roman" w:hAnsi="Times New Roman" w:cs="Times New Roman"/>
+          <w:color w:val="auto"/>
+        </w:rPr>
+        <w:t>Infact</w:t>
+      </w:r>
+      <w:proofErr w:type="spellEnd"/>
+      <w:r>
+        <w:rPr>
+          <w:rFonts w:ascii="Times New Roman" w:eastAsia="Times New Roman" w:hAnsi="Times New Roman" w:cs="Times New Roman"/>
+          <w:color w:val="auto"/>
+        </w:rPr>
+        <w:t xml:space="preserve">, this ensures results across runs. By default, if </w:t>
+      </w:r>
+      <w:proofErr w:type="spellStart"/>
+      <w:r>
+        <w:rPr>
+          <w:rFonts w:ascii="Times New Roman" w:eastAsia="Times New Roman" w:hAnsi="Times New Roman" w:cs="Times New Roman"/>
+          <w:color w:val="auto"/>
+        </w:rPr>
+        <w:t>random_state</w:t>
+      </w:r>
+      <w:proofErr w:type="spellEnd"/>
+      <w:r>
+        <w:rPr>
+          <w:rFonts w:ascii="Times New Roman" w:eastAsia="Times New Roman" w:hAnsi="Times New Roman" w:cs="Times New Roman"/>
+          <w:color w:val="auto"/>
+        </w:rPr>
+        <w:t xml:space="preserve"> is not set, it will be set to “None”</w:t>
       </w:r>
     </w:p>
     <w:p>
@@ -9155,7 +9217,7 @@
         </w:rPr>
         <w:lastRenderedPageBreak/>
         <w:drawing>
-          <wp:inline distT="0" distB="0" distL="0" distR="0" wp14:anchorId="5746651A" wp14:editId="62865F11">
+          <wp:inline distT="0" distB="0" distL="0" distR="0" wp14:anchorId="5746651A" wp14:editId="7C39596D">
             <wp:extent cx="5943600" cy="3343275"/>
             <wp:effectExtent l="0" t="0" r="0" b="0"/>
             <wp:docPr id="1959930964" name="Picture 1959930964"/>
@@ -9623,7 +9685,7 @@
         </w:rPr>
         <w:lastRenderedPageBreak/>
         <w:drawing>
-          <wp:inline distT="0" distB="0" distL="0" distR="0" wp14:anchorId="5B7B87CF" wp14:editId="4A497E73">
+          <wp:inline distT="0" distB="0" distL="0" distR="0" wp14:anchorId="5B7B87CF" wp14:editId="599675FD">
             <wp:extent cx="5943600" cy="3343275"/>
             <wp:effectExtent l="0" t="0" r="0" b="9525"/>
             <wp:docPr id="156295072" name="Picture 1" descr="A screenshot of a computer&#10;&#10;AI-generated content may be incorrect."/>
@@ -9754,7 +9816,7 @@
           <w:noProof/>
         </w:rPr>
         <w:drawing>
-          <wp:inline distT="0" distB="0" distL="0" distR="0" wp14:anchorId="791B4A73" wp14:editId="4E6A63E0">
+          <wp:inline distT="0" distB="0" distL="0" distR="0" wp14:anchorId="791B4A73" wp14:editId="73CEA4D5">
             <wp:extent cx="5943600" cy="3343275"/>
             <wp:effectExtent l="0" t="0" r="0" b="0"/>
             <wp:docPr id="1530520452" name="Picture 1530520452"/>
@@ -9995,7 +10057,7 @@
         </w:rPr>
         <w:lastRenderedPageBreak/>
         <w:drawing>
-          <wp:inline distT="0" distB="0" distL="0" distR="0" wp14:anchorId="13A2A5C1" wp14:editId="5991EE28">
+          <wp:inline distT="0" distB="0" distL="0" distR="0" wp14:anchorId="13A2A5C1" wp14:editId="7263A570">
             <wp:extent cx="5943600" cy="3343275"/>
             <wp:effectExtent l="0" t="0" r="0" b="0"/>
             <wp:docPr id="1954916980" name="Picture 1954916980"/>
@@ -10051,7 +10113,7 @@
           <w:noProof/>
         </w:rPr>
         <w:drawing>
-          <wp:inline distT="0" distB="0" distL="0" distR="0" wp14:anchorId="027CEE7F" wp14:editId="248320FA">
+          <wp:inline distT="0" distB="0" distL="0" distR="0" wp14:anchorId="027CEE7F" wp14:editId="4400EBD2">
             <wp:extent cx="5943600" cy="3343275"/>
             <wp:effectExtent l="0" t="0" r="0" b="9525"/>
             <wp:docPr id="1672229220" name="Picture 1" descr="A screenshot of a computer&#10;&#10;AI-generated content may be incorrect."/>
@@ -10147,7 +10209,7 @@
           <w:noProof/>
         </w:rPr>
         <w:drawing>
-          <wp:inline distT="0" distB="0" distL="0" distR="0" wp14:anchorId="6B2E0840" wp14:editId="3AF81031">
+          <wp:inline distT="0" distB="0" distL="0" distR="0" wp14:anchorId="6B2E0840" wp14:editId="1F02A858">
             <wp:extent cx="5943600" cy="3343275"/>
             <wp:effectExtent l="0" t="0" r="0" b="0"/>
             <wp:docPr id="1011223645" name="Picture 1011223645"/>
@@ -10395,7 +10457,7 @@
         </w:rPr>
         <w:lastRenderedPageBreak/>
         <w:drawing>
-          <wp:inline distT="0" distB="0" distL="0" distR="0" wp14:anchorId="61EB7D03" wp14:editId="2985CB15">
+          <wp:inline distT="0" distB="0" distL="0" distR="0" wp14:anchorId="61EB7D03" wp14:editId="24B06AEC">
             <wp:extent cx="5943600" cy="3343275"/>
             <wp:effectExtent l="0" t="0" r="0" b="9525"/>
             <wp:docPr id="1314645804" name="Picture 1" descr="A screenshot of a computer&#10;&#10;AI-generated content may be incorrect."/>
@@ -10518,7 +10580,7 @@
           <w:noProof/>
         </w:rPr>
         <w:drawing>
-          <wp:inline distT="0" distB="0" distL="0" distR="0" wp14:anchorId="1B9A65EF" wp14:editId="4F63992C">
+          <wp:inline distT="0" distB="0" distL="0" distR="0" wp14:anchorId="1B9A65EF" wp14:editId="216B1925">
             <wp:extent cx="5943600" cy="3343275"/>
             <wp:effectExtent l="0" t="0" r="0" b="0"/>
             <wp:docPr id="755903205" name="Picture 755903205"/>
@@ -10672,7 +10734,25 @@
           <w:sz w:val="28"/>
           <w:szCs w:val="28"/>
         </w:rPr>
-        <w:t xml:space="preserve"> The solver = ‘liblinear’ is a reliable solver </w:t>
+        <w:t xml:space="preserve"> The solver = ‘</w:t>
+      </w:r>
+      <w:proofErr w:type="spellStart"/>
+      <w:r>
+        <w:rPr>
+          <w:rFonts w:ascii="Times New Roman" w:eastAsia="Times New Roman" w:hAnsi="Times New Roman" w:cs="Times New Roman"/>
+          <w:sz w:val="28"/>
+          <w:szCs w:val="28"/>
+        </w:rPr>
+        <w:t>liblinear</w:t>
+      </w:r>
+      <w:proofErr w:type="spellEnd"/>
+      <w:r>
+        <w:rPr>
+          <w:rFonts w:ascii="Times New Roman" w:eastAsia="Times New Roman" w:hAnsi="Times New Roman" w:cs="Times New Roman"/>
+          <w:sz w:val="28"/>
+          <w:szCs w:val="28"/>
+        </w:rPr>
+        <w:t xml:space="preserve">’ is a reliable solver </w:t>
       </w:r>
       <w:r>
         <w:rPr>
@@ -10696,23 +10776,95 @@
           <w:sz w:val="28"/>
           <w:szCs w:val="28"/>
         </w:rPr>
-        <w:t>, also liblinear is one of the few solvers that support both L1 And L2</w:t>
-      </w:r>
-      <w:r>
-        <w:rPr>
-          <w:rFonts w:ascii="Times New Roman" w:eastAsia="Times New Roman" w:hAnsi="Times New Roman" w:cs="Times New Roman"/>
-          <w:sz w:val="28"/>
-          <w:szCs w:val="28"/>
-        </w:rPr>
-        <w:t>, The class_weight = ‘balance’, automatically adjust the weights inversely proportional to class frequencies.</w:t>
-      </w:r>
-      <w:r>
-        <w:rPr>
-          <w:rFonts w:ascii="Times New Roman" w:eastAsia="Times New Roman" w:hAnsi="Times New Roman" w:cs="Times New Roman"/>
-          <w:sz w:val="28"/>
-          <w:szCs w:val="28"/>
-        </w:rPr>
-        <w:t xml:space="preserve">, without this, the model might focus on the majority class (Non-Fatal) and ignore the minority (Fatal), </w:t>
+        <w:t xml:space="preserve">, also </w:t>
+      </w:r>
+      <w:proofErr w:type="spellStart"/>
+      <w:r>
+        <w:rPr>
+          <w:rFonts w:ascii="Times New Roman" w:eastAsia="Times New Roman" w:hAnsi="Times New Roman" w:cs="Times New Roman"/>
+          <w:sz w:val="28"/>
+          <w:szCs w:val="28"/>
+        </w:rPr>
+        <w:t>liblinear</w:t>
+      </w:r>
+      <w:proofErr w:type="spellEnd"/>
+      <w:r>
+        <w:rPr>
+          <w:rFonts w:ascii="Times New Roman" w:eastAsia="Times New Roman" w:hAnsi="Times New Roman" w:cs="Times New Roman"/>
+          <w:sz w:val="28"/>
+          <w:szCs w:val="28"/>
+        </w:rPr>
+        <w:t xml:space="preserve"> is one of the few solvers that support both L1 And L2</w:t>
+      </w:r>
+      <w:r>
+        <w:rPr>
+          <w:rFonts w:ascii="Times New Roman" w:eastAsia="Times New Roman" w:hAnsi="Times New Roman" w:cs="Times New Roman"/>
+          <w:sz w:val="28"/>
+          <w:szCs w:val="28"/>
+        </w:rPr>
+        <w:t xml:space="preserve">, </w:t>
+      </w:r>
+      <w:proofErr w:type="gramStart"/>
+      <w:r>
+        <w:rPr>
+          <w:rFonts w:ascii="Times New Roman" w:eastAsia="Times New Roman" w:hAnsi="Times New Roman" w:cs="Times New Roman"/>
+          <w:sz w:val="28"/>
+          <w:szCs w:val="28"/>
+        </w:rPr>
+        <w:t>The</w:t>
+      </w:r>
+      <w:proofErr w:type="gramEnd"/>
+      <w:r>
+        <w:rPr>
+          <w:rFonts w:ascii="Times New Roman" w:eastAsia="Times New Roman" w:hAnsi="Times New Roman" w:cs="Times New Roman"/>
+          <w:sz w:val="28"/>
+          <w:szCs w:val="28"/>
+        </w:rPr>
+        <w:t xml:space="preserve"> </w:t>
+      </w:r>
+      <w:proofErr w:type="spellStart"/>
+      <w:r>
+        <w:rPr>
+          <w:rFonts w:ascii="Times New Roman" w:eastAsia="Times New Roman" w:hAnsi="Times New Roman" w:cs="Times New Roman"/>
+          <w:sz w:val="28"/>
+          <w:szCs w:val="28"/>
+        </w:rPr>
+        <w:t>class_weight</w:t>
+      </w:r>
+      <w:proofErr w:type="spellEnd"/>
+      <w:r>
+        <w:rPr>
+          <w:rFonts w:ascii="Times New Roman" w:eastAsia="Times New Roman" w:hAnsi="Times New Roman" w:cs="Times New Roman"/>
+          <w:sz w:val="28"/>
+          <w:szCs w:val="28"/>
+        </w:rPr>
+        <w:t xml:space="preserve"> = ‘balance’, automatically adjust the weights inversely proportional to class frequencies.</w:t>
+      </w:r>
+      <w:r>
+        <w:rPr>
+          <w:rFonts w:ascii="Times New Roman" w:eastAsia="Times New Roman" w:hAnsi="Times New Roman" w:cs="Times New Roman"/>
+          <w:sz w:val="28"/>
+          <w:szCs w:val="28"/>
+        </w:rPr>
+        <w:t>, without this, the model might focus on the majority class (</w:t>
+      </w:r>
+      <w:proofErr w:type="gramStart"/>
+      <w:r>
+        <w:rPr>
+          <w:rFonts w:ascii="Times New Roman" w:eastAsia="Times New Roman" w:hAnsi="Times New Roman" w:cs="Times New Roman"/>
+          <w:sz w:val="28"/>
+          <w:szCs w:val="28"/>
+        </w:rPr>
+        <w:t>Non-Fatal</w:t>
+      </w:r>
+      <w:proofErr w:type="gramEnd"/>
+      <w:r>
+        <w:rPr>
+          <w:rFonts w:ascii="Times New Roman" w:eastAsia="Times New Roman" w:hAnsi="Times New Roman" w:cs="Times New Roman"/>
+          <w:sz w:val="28"/>
+          <w:szCs w:val="28"/>
+        </w:rPr>
+        <w:t xml:space="preserve">) and ignore the minority (Fatal), </w:t>
       </w:r>
       <w:r>
         <w:rPr>
@@ -10749,7 +10901,7 @@
         </w:rPr>
         <w:lastRenderedPageBreak/>
         <w:drawing>
-          <wp:inline distT="0" distB="0" distL="0" distR="0" wp14:anchorId="3BFC3E69" wp14:editId="573CB7CA">
+          <wp:inline distT="0" distB="0" distL="0" distR="0" wp14:anchorId="3BFC3E69" wp14:editId="32AC9208">
             <wp:extent cx="5943600" cy="3343275"/>
             <wp:effectExtent l="0" t="0" r="0" b="0"/>
             <wp:docPr id="2062040789" name="Picture 2062040789"/>
@@ -11104,7 +11256,7 @@
           <w:noProof/>
         </w:rPr>
         <w:drawing>
-          <wp:inline distT="0" distB="0" distL="0" distR="0" wp14:anchorId="63456A50" wp14:editId="238F56AF">
+          <wp:inline distT="0" distB="0" distL="0" distR="0" wp14:anchorId="63456A50" wp14:editId="7EDE5695">
             <wp:extent cx="5943600" cy="3343275"/>
             <wp:effectExtent l="0" t="0" r="0" b="9525"/>
             <wp:docPr id="1094287727" name="Picture 1" descr="A screenshot of a computer&#10;&#10;AI-generated content may be incorrect."/>
@@ -11154,13 +11306,41 @@
           <w:szCs w:val="28"/>
         </w:rPr>
       </w:pPr>
-      <w:r>
-        <w:rPr>
-          <w:rFonts w:ascii="Times New Roman" w:eastAsia="Times New Roman" w:hAnsi="Times New Roman" w:cs="Times New Roman"/>
-          <w:sz w:val="28"/>
-          <w:szCs w:val="28"/>
-        </w:rPr>
-        <w:t>Acurracy: In overal the model predicts correctly 80% of the time, for the precision only the 36.7% of the predicted Fa</w:t>
+      <w:proofErr w:type="spellStart"/>
+      <w:r>
+        <w:rPr>
+          <w:rFonts w:ascii="Times New Roman" w:eastAsia="Times New Roman" w:hAnsi="Times New Roman" w:cs="Times New Roman"/>
+          <w:sz w:val="28"/>
+          <w:szCs w:val="28"/>
+        </w:rPr>
+        <w:t>Acurracy</w:t>
+      </w:r>
+      <w:proofErr w:type="spellEnd"/>
+      <w:r>
+        <w:rPr>
+          <w:rFonts w:ascii="Times New Roman" w:eastAsia="Times New Roman" w:hAnsi="Times New Roman" w:cs="Times New Roman"/>
+          <w:sz w:val="28"/>
+          <w:szCs w:val="28"/>
+        </w:rPr>
+        <w:t xml:space="preserve">: In </w:t>
+      </w:r>
+      <w:proofErr w:type="spellStart"/>
+      <w:r>
+        <w:rPr>
+          <w:rFonts w:ascii="Times New Roman" w:eastAsia="Times New Roman" w:hAnsi="Times New Roman" w:cs="Times New Roman"/>
+          <w:sz w:val="28"/>
+          <w:szCs w:val="28"/>
+        </w:rPr>
+        <w:t>overal</w:t>
+      </w:r>
+      <w:proofErr w:type="spellEnd"/>
+      <w:r>
+        <w:rPr>
+          <w:rFonts w:ascii="Times New Roman" w:eastAsia="Times New Roman" w:hAnsi="Times New Roman" w:cs="Times New Roman"/>
+          <w:sz w:val="28"/>
+          <w:szCs w:val="28"/>
+        </w:rPr>
+        <w:t xml:space="preserve"> the model predicts correctly 80% of the time, for the precision only the 36.7% of the predicted Fa</w:t>
       </w:r>
       <w:r>
         <w:rPr>
@@ -11178,13 +11358,23 @@
         </w:rPr>
         <w:t xml:space="preserve"> cases were fatal, </w:t>
       </w:r>
-      <w:r>
-        <w:rPr>
-          <w:rFonts w:ascii="Times New Roman" w:eastAsia="Times New Roman" w:hAnsi="Times New Roman" w:cs="Times New Roman"/>
-          <w:sz w:val="28"/>
-          <w:szCs w:val="28"/>
-        </w:rPr>
-        <w:t>The recall about 61.8% of actual fatal cases were correctly identified</w:t>
+      <w:proofErr w:type="gramStart"/>
+      <w:r>
+        <w:rPr>
+          <w:rFonts w:ascii="Times New Roman" w:eastAsia="Times New Roman" w:hAnsi="Times New Roman" w:cs="Times New Roman"/>
+          <w:sz w:val="28"/>
+          <w:szCs w:val="28"/>
+        </w:rPr>
+        <w:t>The</w:t>
+      </w:r>
+      <w:proofErr w:type="gramEnd"/>
+      <w:r>
+        <w:rPr>
+          <w:rFonts w:ascii="Times New Roman" w:eastAsia="Times New Roman" w:hAnsi="Times New Roman" w:cs="Times New Roman"/>
+          <w:sz w:val="28"/>
+          <w:szCs w:val="28"/>
+        </w:rPr>
+        <w:t xml:space="preserve"> recall about 61.8% of actual fatal cases were correctly identified</w:t>
       </w:r>
       <w:r>
         <w:rPr>
@@ -11208,7 +11398,25 @@
           <w:sz w:val="28"/>
           <w:szCs w:val="28"/>
         </w:rPr>
-        <w:t>. In conclusion the accuracy seems high, but it can be misleadding in imbalanced datasets.</w:t>
+        <w:t xml:space="preserve">. In conclusion the accuracy seems high, but it can be </w:t>
+      </w:r>
+      <w:proofErr w:type="spellStart"/>
+      <w:r>
+        <w:rPr>
+          <w:rFonts w:ascii="Times New Roman" w:eastAsia="Times New Roman" w:hAnsi="Times New Roman" w:cs="Times New Roman"/>
+          <w:sz w:val="28"/>
+          <w:szCs w:val="28"/>
+        </w:rPr>
+        <w:t>misleadding</w:t>
+      </w:r>
+      <w:proofErr w:type="spellEnd"/>
+      <w:r>
+        <w:rPr>
+          <w:rFonts w:ascii="Times New Roman" w:eastAsia="Times New Roman" w:hAnsi="Times New Roman" w:cs="Times New Roman"/>
+          <w:sz w:val="28"/>
+          <w:szCs w:val="28"/>
+        </w:rPr>
+        <w:t xml:space="preserve"> in imbalanced datasets.</w:t>
       </w:r>
     </w:p>
     <w:p>
@@ -11274,7 +11482,7 @@
           <w:noProof/>
         </w:rPr>
         <w:drawing>
-          <wp:inline distT="0" distB="0" distL="0" distR="0" wp14:anchorId="16898854" wp14:editId="548D993E">
+          <wp:inline distT="0" distB="0" distL="0" distR="0" wp14:anchorId="16898854" wp14:editId="5D4017CF">
             <wp:extent cx="5943600" cy="3343275"/>
             <wp:effectExtent l="0" t="0" r="0" b="0"/>
             <wp:docPr id="1026151432" name="Picture 1026151432"/>
@@ -11541,7 +11749,7 @@
         </w:rPr>
         <w:lastRenderedPageBreak/>
         <w:drawing>
-          <wp:inline distT="0" distB="0" distL="0" distR="0" wp14:anchorId="7DEBFCC3" wp14:editId="3DA1D3C9">
+          <wp:inline distT="0" distB="0" distL="0" distR="0" wp14:anchorId="7DEBFCC3" wp14:editId="44C88FC3">
             <wp:extent cx="5943600" cy="3343275"/>
             <wp:effectExtent l="0" t="0" r="0" b="9525"/>
             <wp:docPr id="892734696" name="Picture 1" descr="A screenshot of a computer&#10;&#10;AI-generated content may be incorrect."/>
@@ -12357,7 +12565,25 @@
           <w:sz w:val="28"/>
           <w:szCs w:val="28"/>
         </w:rPr>
-        <w:t>The analysis of Toronto's traffic collision data (KSI) highlighted key factors contributing to fatal accidents. Only 14.1% of collisions were fatal, showing a class imbalance that could affect model accuracy, which can be improved using techniques like SMOTE. Fatal accidents were more common in dark or dim lighting (28%) and on icy or slushy roads (22%). Impaired driving and pedestrians crossing without the right of way also increased fatality risks, with a 40% fatality rate for jaywalking. Missing data in FATAL_NO (95%) and EMERG_VEH (99.7%) reduced their reliability. To improve the model, using XGBoost or Random Forest with class weights and focusing on precision-recall metrics is recommended. Policy improvements like better lighting, road maintenance, and increased DUI checkpoints could reduce accidents. Future work should include analyzing rush hour and holiday patterns and using geospatial clustering to identify high-risk areas.</w:t>
+        <w:t xml:space="preserve">The analysis of Toronto's traffic collision data (KSI) highlighted key factors contributing to fatal accidents. Only 14.1% of collisions were fatal, showing a class imbalance that could affect model accuracy, which can be improved using techniques like SMOTE. Fatal accidents were more common in dark or dim lighting (28%) and on icy or slushy roads (22%). Impaired driving and pedestrians crossing without the right of way also increased fatality risks, with a 40% fatality rate for jaywalking. Missing data in FATAL_NO (95%) and EMERG_VEH (99.7%) reduced their reliability. To improve the model, using </w:t>
+      </w:r>
+      <w:proofErr w:type="spellStart"/>
+      <w:r>
+        <w:rPr>
+          <w:rFonts w:ascii="Times New Roman" w:eastAsia="Times New Roman" w:hAnsi="Times New Roman" w:cs="Times New Roman"/>
+          <w:sz w:val="28"/>
+          <w:szCs w:val="28"/>
+        </w:rPr>
+        <w:t>XGBoost</w:t>
+      </w:r>
+      <w:proofErr w:type="spellEnd"/>
+      <w:r>
+        <w:rPr>
+          <w:rFonts w:ascii="Times New Roman" w:eastAsia="Times New Roman" w:hAnsi="Times New Roman" w:cs="Times New Roman"/>
+          <w:sz w:val="28"/>
+          <w:szCs w:val="28"/>
+        </w:rPr>
+        <w:t xml:space="preserve"> or Random Forest with class weights and focusing on precision-recall metrics is recommended. Policy improvements like better lighting, road maintenance, and increased DUI checkpoints could reduce accidents. Future work should include analyzing rush hour and holiday patterns and using geospatial clustering to identify high-risk areas.</w:t>
       </w:r>
     </w:p>
     <w:sectPr>

</xml_diff>